<commit_message>
Expand Discussion with international and Japan-specific malpractice literature, target 2,500-3,000 words
Co-Authored-By: Tatsuki Onishi <bougtoir@gmail.com>
</commit_message>
<xml_diff>
--- a/medical_accident_its_analysis/manuscript/hp_manuscript_en.docx
+++ b/medical_accident_its_analysis/manuscript/hp_manuscript_en.docx
@@ -2865,6 +2865,20 @@
           <w:i w:val="0"/>
           <w:sz w:val="24"/>
         </w:rPr>
+        <w:t>A null result is not merely a failure to detect an effect. The narrow confidence intervals and pre-specified equivalence margins allow us to say that, if litigation risk does influence specialty-level workforce growth, the magnitude is too small to matter for workforce planning. This is an important distinction for policy debates that treat malpractice pressure as a major driver of physician distribution.</w:t>
+      </w:r>
+    </w:p>
+    <w:p>
+      <w:pPr>
+        <w:spacing w:line="480" w:lineRule="auto" w:after="120"/>
+      </w:pPr>
+      <w:r>
+        <w:rPr>
+          <w:rFonts w:ascii="Times New Roman" w:hAnsi="Times New Roman"/>
+          <w:b w:val="0"/>
+          <w:i w:val="0"/>
+          <w:sz w:val="24"/>
+        </w:rPr>
         <w:t>The raw-count sensitivity in our study did not recover a negative association, indicating that size confounding and interpolation are sufficient to produce spurious negative findings. This is a cautionary example for workforce research that pairs administrative count series, and it underscores why rate-based, measured-only designs are preferable when testing litigation-workforce hypotheses.</w:t>
       </w:r>
     </w:p>
@@ -2879,14 +2893,14 @@
           <w:i w:val="0"/>
           <w:sz w:val="24"/>
         </w:rPr>
-        <w:t>Why might the workforce be so insensitive to litigation risk? A plausible interpretation is that structural incentives offset it. The Japan Obstetric Compensation System for Cerebral Palsy (2009) introduced no-fault compensation that reduced adversarial litigation pressure in obstetrics, and our data show a concurrent obstetric facility signal.</w:t>
+        <w:t>International evidence on tort reform and physician supply is consistent with a small or context-specific effect. Matsa found that U.S. state damage caps increased the supply of frontier rural specialists by 10-12 percent, but did not affect physician supply for the average resident.</w:t>
       </w:r>
       <w:r>
         <w:rPr>
           <w:rFonts w:ascii="Times New Roman" w:hAnsi="Times New Roman"/>
           <w:sz w:val="22"/>
         </w:rPr>
-        <w:t>[6]</w:t>
+        <w:t>[13]</w:t>
       </w:r>
       <w:r>
         <w:rPr>
@@ -2895,7 +2909,297 @@
           <w:i w:val="0"/>
           <w:sz w:val="24"/>
         </w:rPr>
-        <w:t xml:space="preserve"> Other structural incentives, including the fee-for-service remuneration of high-acuity procedures, may also play a role, although our data cannot isolate their effects from other institutional factors. Under this view, maldistribution is better addressed through payment design and no-fault compensation than through litigation-avoidance messaging.</w:t>
+        <w:t xml:space="preserve"> Hyman and colleagues, examining the 2003 Texas reforms, found no measurable increase in physician supply for high-malpractice-risk specialties, primary care, or rural physicians.</w:t>
+      </w:r>
+      <w:r>
+        <w:rPr>
+          <w:rFonts w:ascii="Times New Roman" w:hAnsi="Times New Roman"/>
+          <w:sz w:val="22"/>
+        </w:rPr>
+        <w:t>[14]</w:t>
+      </w:r>
+      <w:r>
+        <w:rPr>
+          <w:rFonts w:ascii="Times New Roman" w:hAnsi="Times New Roman"/>
+          <w:b w:val="0"/>
+          <w:i w:val="0"/>
+          <w:sz w:val="24"/>
+        </w:rPr>
+        <w:t xml:space="preserve"> Frakes and co-workers showed that negligence-standard reforms could shift the composition of the physician workforce toward surgery in some regions, yet the effect was localized and modest.</w:t>
+      </w:r>
+      <w:r>
+        <w:rPr>
+          <w:rFonts w:ascii="Times New Roman" w:hAnsi="Times New Roman"/>
+          <w:sz w:val="22"/>
+        </w:rPr>
+        <w:t>[15]</w:t>
+      </w:r>
+      <w:r>
+        <w:rPr>
+          <w:rFonts w:ascii="Times New Roman" w:hAnsi="Times New Roman"/>
+          <w:b w:val="0"/>
+          <w:i w:val="0"/>
+          <w:sz w:val="24"/>
+        </w:rPr>
+        <w:t xml:space="preserve"> Against this backdrop, a null effect of civil litigation risk on Japanese specialty supply is not surprising, especially in a system with comparatively low litigation volume and predictable damages.</w:t>
+      </w:r>
+    </w:p>
+    <w:p>
+      <w:pPr>
+        <w:spacing w:line="480" w:lineRule="auto" w:after="120"/>
+      </w:pPr>
+      <w:r>
+        <w:rPr>
+          <w:rFonts w:ascii="Times New Roman" w:hAnsi="Times New Roman"/>
+          <w:b w:val="0"/>
+          <w:i w:val="0"/>
+          <w:sz w:val="24"/>
+        </w:rPr>
+        <w:t>Even when litigation risk does not change the number of physicians, it may alter clinical behaviour through defensive medicine. Kessler and McClellan showed that U.S. malpractice reforms reduced medical expenditures for elderly heart-disease patients without increasing mortality or complications, suggesting that defensive practice is one margin of adjustment to liability pressure.</w:t>
+      </w:r>
+      <w:r>
+        <w:rPr>
+          <w:rFonts w:ascii="Times New Roman" w:hAnsi="Times New Roman"/>
+          <w:sz w:val="22"/>
+        </w:rPr>
+        <w:t>[16]</w:t>
+      </w:r>
+      <w:r>
+        <w:rPr>
+          <w:rFonts w:ascii="Times New Roman" w:hAnsi="Times New Roman"/>
+          <w:b w:val="0"/>
+          <w:i w:val="0"/>
+          <w:sz w:val="24"/>
+        </w:rPr>
+        <w:t xml:space="preserve"> Subsequent reassessments have debated the magnitude and robustness of this effect, but the conceptual point remains: physicians can respond to liability risk by changing how they practise rather than by exiting a specialty.</w:t>
+      </w:r>
+      <w:r>
+        <w:rPr>
+          <w:rFonts w:ascii="Times New Roman" w:hAnsi="Times New Roman"/>
+          <w:sz w:val="22"/>
+        </w:rPr>
+        <w:t>[17]</w:t>
+      </w:r>
+      <w:r>
+        <w:rPr>
+          <w:rFonts w:ascii="Times New Roman" w:hAnsi="Times New Roman"/>
+          <w:b w:val="0"/>
+          <w:i w:val="0"/>
+          <w:sz w:val="24"/>
+        </w:rPr>
+        <w:t xml:space="preserve"> In Japan, fee-for-service reimbursement rewards the high-acuity procedural work that also carries litigation exposure, so the financial return to remaining in surgery, obstetrics, or interventional specialties may dominate any deterrent from civil claims.</w:t>
+      </w:r>
+    </w:p>
+    <w:p>
+      <w:pPr>
+        <w:spacing w:line="480" w:lineRule="auto" w:after="120"/>
+      </w:pPr>
+      <w:r>
+        <w:rPr>
+          <w:rFonts w:ascii="Times New Roman" w:hAnsi="Times New Roman"/>
+          <w:b w:val="0"/>
+          <w:i w:val="0"/>
+          <w:sz w:val="24"/>
+        </w:rPr>
+        <w:t>Japan's litigation environment itself dampens the likelihood of a flight-from-risk response. Taniguchi and colleagues analysed all closed malpractice claims reported by the Supreme Court from 2006 to 2021 and found that more than half ended in settlement, plaintiffs won only about a quarter of judgments, and the number of claims has been declining, especially in obstetrics and gynaecology.</w:t>
+      </w:r>
+      <w:r>
+        <w:rPr>
+          <w:rFonts w:ascii="Times New Roman" w:hAnsi="Times New Roman"/>
+          <w:sz w:val="22"/>
+        </w:rPr>
+        <w:t>[18]</w:t>
+      </w:r>
+      <w:r>
+        <w:rPr>
+          <w:rFonts w:ascii="Times New Roman" w:hAnsi="Times New Roman"/>
+          <w:b w:val="0"/>
+          <w:i w:val="0"/>
+          <w:sz w:val="24"/>
+        </w:rPr>
+        <w:t xml:space="preserve"> The Court data we use therefore describe a civil system that is low-volume, settlement-prone, and comparatively favourable to physicians. This context makes it unlikely that routine civil litigation risk alone would drive physicians out of high-risk fields.</w:t>
+      </w:r>
+    </w:p>
+    <w:p>
+      <w:pPr>
+        <w:spacing w:line="480" w:lineRule="auto" w:after="120"/>
+      </w:pPr>
+      <w:r>
+        <w:rPr>
+          <w:rFonts w:ascii="Times New Roman" w:hAnsi="Times New Roman"/>
+          <w:b w:val="0"/>
+          <w:i w:val="0"/>
+          <w:sz w:val="24"/>
+        </w:rPr>
+        <w:t>The Japan Obstetric Compensation System for Cerebral Palsy (2009) illustrates a different mechanism. It was introduced partly because of a shortage of young obstetricians and regional gaps in maternity care, and it combined no-fault compensation with investigation and prevention.</w:t>
+      </w:r>
+      <w:r>
+        <w:rPr>
+          <w:rFonts w:ascii="Times New Roman" w:hAnsi="Times New Roman"/>
+          <w:sz w:val="22"/>
+        </w:rPr>
+        <w:t>[19]</w:t>
+      </w:r>
+      <w:r>
+        <w:rPr>
+          <w:rFonts w:ascii="Times New Roman" w:hAnsi="Times New Roman"/>
+          <w:b w:val="0"/>
+          <w:i w:val="0"/>
+          <w:sz w:val="24"/>
+        </w:rPr>
+        <w:t xml:space="preserve"> Our hospital-level JOCS-CP indicator is associated with obstetric hospital growth, suggesting that removing adversarial litigation pressure can support facility supply, although we cannot isolate the compensation effect from concurrent obstetric policies. Civil litigation exposure is also distinct from criminal prosecution. Morita exploited the 2004 Fukushima obstetrician prosecution and found a 13 percent decline in obstetricians, with some switching to gynaecology.</w:t>
+      </w:r>
+      <w:r>
+        <w:rPr>
+          <w:rFonts w:ascii="Times New Roman" w:hAnsi="Times New Roman"/>
+          <w:sz w:val="22"/>
+        </w:rPr>
+        <w:t>[20]</w:t>
+      </w:r>
+      <w:r>
+        <w:rPr>
+          <w:rFonts w:ascii="Times New Roman" w:hAnsi="Times New Roman"/>
+          <w:b w:val="0"/>
+          <w:i w:val="0"/>
+          <w:sz w:val="24"/>
+        </w:rPr>
+        <w:t xml:space="preserve"> Criminal cases and their media coverage may be far more salient to career decisions than routine closed civil claims, and our data do not capture that channel.</w:t>
+      </w:r>
+    </w:p>
+    <w:p>
+      <w:pPr>
+        <w:spacing w:line="480" w:lineRule="auto" w:after="120"/>
+      </w:pPr>
+      <w:r>
+        <w:rPr>
+          <w:rFonts w:ascii="Times New Roman" w:hAnsi="Times New Roman"/>
+          <w:b w:val="0"/>
+          <w:i w:val="0"/>
+          <w:sz w:val="24"/>
+        </w:rPr>
+        <w:t>The obstetrics and gynaecology case is the most discussed example of the litigation-workforce nexus, and it is consistent with our interpretation. A recent comparison of Japanese and U.S. medical-legal claims in OB/GYN found that the proportion of malpractice claims in this specialty fell from 15.1 percent in 2004 to 5.2 percent in 2022, and that claims per 100 OB/GYN physicians fell from 0.9 in 2007 to 0.4 in 2016, while maternal and neonatal mortality also declined.</w:t>
+      </w:r>
+      <w:r>
+        <w:rPr>
+          <w:rFonts w:ascii="Times New Roman" w:hAnsi="Times New Roman"/>
+          <w:sz w:val="22"/>
+        </w:rPr>
+        <w:t>[21]</w:t>
+      </w:r>
+      <w:r>
+        <w:rPr>
+          <w:rFonts w:ascii="Times New Roman" w:hAnsi="Times New Roman"/>
+          <w:b w:val="0"/>
+          <w:i w:val="0"/>
+          <w:sz w:val="24"/>
+        </w:rPr>
+        <w:t xml:space="preserve"> The authors attribute this to heightened awareness after a wrongful criminal charge, the JOCS-CP no-fault scheme, standardised clinical guidelines, and the adverse-event investigation system. This is not evidence that lowering litigation risk caused the workforce to grow; it is evidence that obstetric litigation, workforce support, and safety interventions moved together. Surveys of OB/GYN residents in Japan, Korea, and Taiwan likewise show that litigation is reported as a negative factor, but that its perceived importance is smaller where no-fault compensation exists and that workload, lifestyle, and professional interest remain dominant.</w:t>
+      </w:r>
+      <w:r>
+        <w:rPr>
+          <w:rFonts w:ascii="Times New Roman" w:hAnsi="Times New Roman"/>
+          <w:sz w:val="22"/>
+        </w:rPr>
+        <w:t>[22]</w:t>
+      </w:r>
+      <w:r>
+        <w:rPr>
+          <w:rFonts w:ascii="Times New Roman" w:hAnsi="Times New Roman"/>
+          <w:b w:val="0"/>
+          <w:i w:val="0"/>
+          <w:sz w:val="24"/>
+        </w:rPr>
+        <w:t xml:space="preserve"> These findings echo our specialty-level result: litigation may matter for perceptions, but it is not the binding constraint on supply.</w:t>
+      </w:r>
+    </w:p>
+    <w:p>
+      <w:pPr>
+        <w:spacing w:line="480" w:lineRule="auto" w:after="120"/>
+      </w:pPr>
+      <w:r>
+        <w:rPr>
+          <w:rFonts w:ascii="Times New Roman" w:hAnsi="Times New Roman"/>
+          <w:b w:val="0"/>
+          <w:i w:val="0"/>
+          <w:sz w:val="24"/>
+        </w:rPr>
+        <w:t>What do these findings imply for policy? Reducing civil malpractice litigation is unlikely to be a powerful lever for correcting specialty maldistribution in Japan. Structural incentives are more promising: no-fault compensation can de-risk high-acuity specialties, and payment design can reward service in underserved settings and activities. The JOCS-CP experience supports the former; Japan's fee-for-service schedule and rural/urban payment adjustments illustrate the latter. This is not to say that malpractice reform is irrelevant: it may influence defensive medicine, patient compensation, and provider-patient trust. But our evidence does not support the claim that lowering litigation risk will retain physicians in high-risk specialties, and litigation-avoidance messaging should not be the centrepiece of workforce policy.</w:t>
+      </w:r>
+    </w:p>
+    <w:p>
+      <w:pPr>
+        <w:spacing w:line="480" w:lineRule="auto" w:after="120"/>
+      </w:pPr>
+      <w:r>
+        <w:rPr>
+          <w:rFonts w:ascii="Times New Roman" w:hAnsi="Times New Roman"/>
+          <w:b w:val="0"/>
+          <w:i w:val="0"/>
+          <w:sz w:val="24"/>
+        </w:rPr>
+        <w:t>International experience with no-fault compensation is consistent with this policy orientation. New Zealand replaced tort-based medical-injury compensation with a government-funded no-fault scheme in 1974 and, after 2005 reforms, extended coverage to all treatment injuries; this separated compensation from negligence findings and largely barred malpractice litigation.</w:t>
+      </w:r>
+      <w:r>
+        <w:rPr>
+          <w:rFonts w:ascii="Times New Roman" w:hAnsi="Times New Roman"/>
+          <w:sz w:val="22"/>
+        </w:rPr>
+        <w:t>[23]</w:t>
+      </w:r>
+      <w:r>
+        <w:rPr>
+          <w:rFonts w:ascii="Times New Roman" w:hAnsi="Times New Roman"/>
+          <w:b w:val="0"/>
+          <w:i w:val="0"/>
+          <w:sz w:val="24"/>
+        </w:rPr>
+        <w:t xml:space="preserve"> Sweden and Denmark operate similar administrative systems in which neutral experts evaluate claims without requiring proof of provider fault, improving injured patients' access to redress while controlling liability costs and generating patient-safety learning.</w:t>
+      </w:r>
+      <w:r>
+        <w:rPr>
+          <w:rFonts w:ascii="Times New Roman" w:hAnsi="Times New Roman"/>
+          <w:sz w:val="22"/>
+        </w:rPr>
+        <w:t>[24]</w:t>
+      </w:r>
+      <w:r>
+        <w:rPr>
+          <w:rFonts w:ascii="Times New Roman" w:hAnsi="Times New Roman"/>
+          <w:b w:val="0"/>
+          <w:i w:val="0"/>
+          <w:sz w:val="24"/>
+        </w:rPr>
+        <w:t xml:space="preserve"> The JOCS-CP is narrower in scope—it covers only obstetric cerebral palsy—but it moves in the same direction: it provides compensation and cause analysis without a protracted adversarial process. Extending such an approach more broadly would be a structural alternative to repeated calls to reduce malpractice litigation as a workforce strategy.</w:t>
+      </w:r>
+    </w:p>
+    <w:p>
+      <w:pPr>
+        <w:spacing w:line="480" w:lineRule="auto" w:after="120"/>
+      </w:pPr>
+      <w:r>
+        <w:rPr>
+          <w:rFonts w:ascii="Times New Roman" w:hAnsi="Times New Roman"/>
+          <w:b w:val="0"/>
+          <w:i w:val="0"/>
+          <w:sz w:val="24"/>
+        </w:rPr>
+        <w:t>Several questions remain for future research. We cannot observe individual physicians' risk perceptions, career intentions, or responses to media coverage of high-profile cases. The closed-claim rate is an objective exposure measure, but it may not capture the perceived risk that drives specialty choice, especially when criminal prosecutions or sensational media coverage shape beliefs. Helland and Seabury's review concludes that tort reform effects on physician supply are heterogeneous across states and specialties, and that more granular, state-specific designs are needed to settle the question in the U.S. context.</w:t>
+      </w:r>
+      <w:r>
+        <w:rPr>
+          <w:rFonts w:ascii="Times New Roman" w:hAnsi="Times New Roman"/>
+          <w:sz w:val="22"/>
+        </w:rPr>
+        <w:t>[25]</w:t>
+      </w:r>
+      <w:r>
+        <w:rPr>
+          <w:rFonts w:ascii="Times New Roman" w:hAnsi="Times New Roman"/>
+          <w:b w:val="0"/>
+          <w:i w:val="0"/>
+          <w:sz w:val="24"/>
+        </w:rPr>
+        <w:t xml:space="preserve"> Applying similar logic in Japan would require individual-level or prefecture-level career data linked to local litigation, media, and reimbursement environments. Until then, the present specialty-level rate analysis provides the most systematic evidence available on the central policy question: whether malpractice litigation risk drives physicians away from high-risk specialties. The answer is that it does not, at least not in a way that is detectable or policy-relevant in 16 years of national data.</w:t>
       </w:r>
     </w:p>
     <w:p>
@@ -3146,6 +3450,162 @@
           <w:sz w:val="20"/>
         </w:rPr>
         <w:t>12. Angrist JD, Pischke JS. Mostly Harmless Econometrics. Princeton: Princeton University Press; 2009.</w:t>
+      </w:r>
+    </w:p>
+    <w:p>
+      <w:pPr>
+        <w:spacing w:line="360" w:lineRule="auto"/>
+      </w:pPr>
+      <w:r>
+        <w:rPr>
+          <w:rFonts w:ascii="Times New Roman" w:hAnsi="Times New Roman"/>
+          <w:sz w:val="20"/>
+        </w:rPr>
+        <w:t>13. Matsa DA. Does malpractice liability keep the doctor away? Evidence from tort reform damage caps. J Legal Stud. 2007;36(S2):S143-S182.</w:t>
+      </w:r>
+    </w:p>
+    <w:p>
+      <w:pPr>
+        <w:spacing w:line="360" w:lineRule="auto"/>
+      </w:pPr>
+      <w:r>
+        <w:rPr>
+          <w:rFonts w:ascii="Times New Roman" w:hAnsi="Times New Roman"/>
+          <w:sz w:val="20"/>
+        </w:rPr>
+        <w:t>14. Hyman DA, Silver C, Black B, Paik M. Does tort reform affect physician supply? Evidence from Texas. Int Rev Law Econ. 2015;42:203-218.</w:t>
+      </w:r>
+    </w:p>
+    <w:p>
+      <w:pPr>
+        <w:spacing w:line="360" w:lineRule="auto"/>
+      </w:pPr>
+      <w:r>
+        <w:rPr>
+          <w:rFonts w:ascii="Times New Roman" w:hAnsi="Times New Roman"/>
+          <w:sz w:val="20"/>
+        </w:rPr>
+        <w:t>15. Frakes MD, Frank MB, Seabury SA. The effect of malpractice law on physician supply: Evidence from negligence-standard reforms. J Health Econ. 2020;70:1-16.</w:t>
+      </w:r>
+    </w:p>
+    <w:p>
+      <w:pPr>
+        <w:spacing w:line="360" w:lineRule="auto"/>
+      </w:pPr>
+      <w:r>
+        <w:rPr>
+          <w:rFonts w:ascii="Times New Roman" w:hAnsi="Times New Roman"/>
+          <w:sz w:val="20"/>
+        </w:rPr>
+        <w:t>16. Kessler DP, McClellan MB. Do doctors practice defensive medicine?. Q J Econ. 1996;111(2):353-390.</w:t>
+      </w:r>
+    </w:p>
+    <w:p>
+      <w:pPr>
+        <w:spacing w:line="360" w:lineRule="auto"/>
+      </w:pPr>
+      <w:r>
+        <w:rPr>
+          <w:rFonts w:ascii="Times New Roman" w:hAnsi="Times New Roman"/>
+          <w:sz w:val="20"/>
+        </w:rPr>
+        <w:t>17. Sloan FA, Shadle JH. Is there empirical evidence for "Defensive Medicine"? A reassessment. J Health Econ. 2008;27(2):481-491.</w:t>
+      </w:r>
+    </w:p>
+    <w:p>
+      <w:pPr>
+        <w:spacing w:line="360" w:lineRule="auto"/>
+      </w:pPr>
+      <w:r>
+        <w:rPr>
+          <w:rFonts w:ascii="Times New Roman" w:hAnsi="Times New Roman"/>
+          <w:sz w:val="20"/>
+        </w:rPr>
+        <w:t>18. Taniguchi K, Watari T, Nagoshi K. Characteristics and trends of medical malpractice claims in Japan between 2006 and 2021. PLoS One. 2023;18(12):e0296155.</w:t>
+      </w:r>
+    </w:p>
+    <w:p>
+      <w:pPr>
+        <w:spacing w:line="360" w:lineRule="auto"/>
+      </w:pPr>
+      <w:r>
+        <w:rPr>
+          <w:rFonts w:ascii="Times New Roman" w:hAnsi="Times New Roman"/>
+          <w:sz w:val="20"/>
+        </w:rPr>
+        <w:t>19. Hasegawa J, Toyokawa S, Ikenoue T, et al. Relevant obstetric factors for cerebral palsy: from the Nationwide Obstetric Compensation System in Japan. PLoS One. 2016;11(1):e0148122.</w:t>
+      </w:r>
+    </w:p>
+    <w:p>
+      <w:pPr>
+        <w:spacing w:line="360" w:lineRule="auto"/>
+      </w:pPr>
+      <w:r>
+        <w:rPr>
+          <w:rFonts w:ascii="Times New Roman" w:hAnsi="Times New Roman"/>
+          <w:sz w:val="20"/>
+        </w:rPr>
+        <w:t>20. Morita H. Criminal prosecution and physician supply. Int Rev Law Econ. 2018;55:1-11.</w:t>
+      </w:r>
+    </w:p>
+    <w:p>
+      <w:pPr>
+        <w:spacing w:line="360" w:lineRule="auto"/>
+      </w:pPr>
+      <w:r>
+        <w:rPr>
+          <w:rFonts w:ascii="Times New Roman" w:hAnsi="Times New Roman"/>
+          <w:sz w:val="20"/>
+        </w:rPr>
+        <w:t>21. Kamijo K, Wada Y, Ishida K, Warsof SL, Saade G, Kawakita T. Medical-legal claims in obstetrics and gynecology: Japan versus the United States. J Healthc Risk Manag. 2025;44(4):5-11.</w:t>
+      </w:r>
+    </w:p>
+    <w:p>
+      <w:pPr>
+        <w:spacing w:line="360" w:lineRule="auto"/>
+      </w:pPr>
+      <w:r>
+        <w:rPr>
+          <w:rFonts w:ascii="Times New Roman" w:hAnsi="Times New Roman"/>
+          <w:sz w:val="20"/>
+        </w:rPr>
+        <w:t>22. Lin PL, Huang JP, Fujii T, Cho EH, Huang MC. A survey of specialty choice among obstetrics and gynecology residents in Japan, Korea, and Taiwan. J Obstet Gynaecol Res. 2022;48(7):1968-1977.</w:t>
+      </w:r>
+    </w:p>
+    <w:p>
+      <w:pPr>
+        <w:spacing w:line="360" w:lineRule="auto"/>
+      </w:pPr>
+      <w:r>
+        <w:rPr>
+          <w:rFonts w:ascii="Times New Roman" w:hAnsi="Times New Roman"/>
+          <w:sz w:val="20"/>
+        </w:rPr>
+        <w:t>23. Bismark M, Paterson R. No-fault compensation in New Zealand: harmonizing injury compensation, provider accountability, and patient safety. Health Aff. 2006;25(1):278-286.</w:t>
+      </w:r>
+    </w:p>
+    <w:p>
+      <w:pPr>
+        <w:spacing w:line="360" w:lineRule="auto"/>
+      </w:pPr>
+      <w:r>
+        <w:rPr>
+          <w:rFonts w:ascii="Times New Roman" w:hAnsi="Times New Roman"/>
+          <w:sz w:val="20"/>
+        </w:rPr>
+        <w:t>24. Mello MM, Kachalia A, Studdert DM. Administrative compensation for medical injuries: lessons from three foreign systems. New York: The Commonwealth Fund; 2011.</w:t>
+      </w:r>
+    </w:p>
+    <w:p>
+      <w:pPr>
+        <w:spacing w:line="360" w:lineRule="auto"/>
+      </w:pPr>
+      <w:r>
+        <w:rPr>
+          <w:rFonts w:ascii="Times New Roman" w:hAnsi="Times New Roman"/>
+          <w:sz w:val="20"/>
+        </w:rPr>
+        <w:t>25. Helland E, Seabury SA. Tort reform and physician labor supply: a review of the evidence. Int Rev Law Econ. 2015;42:192-202.</w:t>
       </w:r>
     </w:p>
     <w:sectPr>

</xml_diff>

<commit_message>
Add JMSR/MAIS report-rate sensitivity to Health Policy submission
- Load medsafe_accidents_by_specialty.csv in build_reanalysis.py and add
  jmsr_lit_correlation() plus jmsr_hospital_sensitivity().
- Report pooled r=0.82 and within-specialty detrended r=-0.02 between
  litigation and JMSR report counts; the joint annual hospital model
  (2016-2024) leaves litigation null (p=0.26) and JMSR not associated
  (p=0.66), with the two rates correlated only r=0.21 within-panel.
- Update build_hp_submission.py: remove remaining hard-coded per-1,000/
  margin/12 literals; add JMSR Methods/Results paragraphs; add
  Supplementary Table 3; bundle everything into output/hp_submission.zip.
- Regenerate all HP artifacts: abstract 214 words, main body ~2,704 words,
  25 references, main manuscript 2 figures + 2 tables.

Co-Authored-By: Tatsuki Onishi <bougtoir@gmail.com>
</commit_message>
<xml_diff>
--- a/medical_accident_its_analysis/manuscript/hp_manuscript_en.docx
+++ b/medical_accident_its_analysis/manuscript/hp_manuscript_en.docx
@@ -221,7 +221,7 @@
           <w:i w:val="0"/>
           <w:sz w:val="24"/>
         </w:rPr>
-        <w:t xml:space="preserve"> We studied 12 core clinical specialties for which the Supreme Court reports specialty-specific litigation. Three official primary series were used: physician counts by specialty from the biennial Statistics of Physicians, Dentists and Pharmacists</w:t>
+        <w:t xml:space="preserve"> We studied 12 core clinical specialties for which the Supreme Court reports specialty-specific litigation. Three official primary series drove the main analysis: physician counts by specialty from the biennial Statistics of Physicians, Dentists and Pharmacists</w:t>
       </w:r>
       <w:r>
         <w:rPr>
@@ -269,7 +269,23 @@
           <w:i w:val="0"/>
           <w:sz w:val="24"/>
         </w:rPr>
-        <w:t>. The full extraction pipeline (with source identifiers and SHA-256 checksums) is documented in the accompanying repository.</w:t>
+        <w:t>. A fourth series, annual medical accident investigation reports by specialty from the Japan Medical Safety Research Organisation (JMSR, 2015-2025), was used in a sensitivity analysis.</w:t>
+      </w:r>
+      <w:r>
+        <w:rPr>
+          <w:rFonts w:ascii="Times New Roman" w:hAnsi="Times New Roman"/>
+          <w:sz w:val="22"/>
+        </w:rPr>
+        <w:t>[11]</w:t>
+      </w:r>
+      <w:r>
+        <w:rPr>
+          <w:rFonts w:ascii="Times New Roman" w:hAnsi="Times New Roman"/>
+          <w:b w:val="0"/>
+          <w:i w:val="0"/>
+          <w:sz w:val="24"/>
+        </w:rPr>
+        <w:t xml:space="preserve"> The full extraction pipeline (with source identifiers and SHA-256 checksums) is documented in the accompanying repository.</w:t>
       </w:r>
     </w:p>
     <w:p>
@@ -403,7 +419,7 @@
           <w:i w:val="0"/>
           <w:sz w:val="24"/>
         </w:rPr>
-        <w:t xml:space="preserve"> Sensitivity analyses repeated the models on (i) the annual hospital series, (ii) a linearly interpolated annual physician series (with degrees of freedom governed by the measured waves, not the interpolated n), and (iii) raw counts instead of rates. Because the primary analyses are confirmatory and null, we did not adjust for multiplicity and interpret the single secondary association (the JOCS-CP indicator) as exploratory. Analyses used Python (statsmodels); code and data are openly available.</w:t>
+        <w:t xml:space="preserve"> Sensitivity analyses repeated the models on (i) the annual hospital series, (ii) a linearly interpolated annual physician series (with degrees of freedom governed by the measured waves, not the interpolated n), (iii) raw counts instead of rates, and (iv) the annual hospital series 2016-2024 additionally controlling for the JMSR report rate (reports per 1,000 physicians). This last test evaluates whether the litigation coefficient is confounded by or collinear with broader medical accident reporting. Because the primary analyses are confirmatory and null, we did not adjust for multiplicity and interpret the single secondary association (the JOCS-CP indicator) as exploratory. Analyses used Python (statsmodels); code and data are openly available.</w:t>
       </w:r>
     </w:p>
     <w:p>
@@ -2830,6 +2846,36 @@
     </w:p>
     <w:p>
       <w:pPr>
+        <w:spacing w:line="480" w:lineRule="auto" w:after="120"/>
+      </w:pPr>
+      <w:r>
+        <w:rPr>
+          <w:rFonts w:ascii="Times New Roman" w:hAnsi="Times New Roman"/>
+          <w:b w:val="0"/>
+          <w:i w:val="0"/>
+          <w:sz w:val="24"/>
+        </w:rPr>
+        <w:t>We also evaluated the JMSR medical accident investigation report counts as a potential confounder or competing exposure.</w:t>
+      </w:r>
+      <w:r>
+        <w:rPr>
+          <w:rFonts w:ascii="Times New Roman" w:hAnsi="Times New Roman"/>
+          <w:sz w:val="22"/>
+        </w:rPr>
+        <w:t>[11]</w:t>
+      </w:r>
+      <w:r>
+        <w:rPr>
+          <w:rFonts w:ascii="Times New Roman" w:hAnsi="Times New Roman"/>
+          <w:b w:val="0"/>
+          <w:i w:val="0"/>
+          <w:sz w:val="24"/>
+        </w:rPr>
+        <w:t xml:space="preserve"> Over 2015-2024, raw litigation and JMSR report counts were strongly correlated across specialties (Pearson r=0.82), because large specialties generate more of both; however, after removing specialty-specific levels and trends the within-specialty correlation was negligible (r=-0.02). A model of annual hospital growth for 2016-2024 that included both the lagged litigation rate and the lagged JMSR report rate left the litigation coefficient essentially unchanged (coefficient +0.0021; p=0.26) and the JMSR term was not associated with hospital growth (p=0.66; Supplementary Table 3). Thus, the null litigation result is not explained by, nor masked by, broader medical accident reporting.</w:t>
+      </w:r>
+    </w:p>
+    <w:p>
+      <w:pPr>
         <w:pStyle w:val="Heading1"/>
       </w:pPr>
       <w:r>
@@ -3225,7 +3271,7 @@
           <w:i w:val="0"/>
           <w:sz w:val="24"/>
         </w:rPr>
-        <w:t>This is an ecological, specialty-level analysis and cannot speak to individual career decisions. The physician census is biennial, giving 9 measured waves; we addressed the limited power directly through equivalence testing and by pooling across specialties, but residual power constraints remain and the equivalence margins are a judgement. Specialty-specific litigation counts could be recovered only from 2008; pre-2008 specialty tables were not retrievable from primary sources. Clinic counts by specialty are published only every 3 years and were used descriptively. Litigation counts are assigned to a principal specialty and, by the Court's own note, do not measure intrinsic specialty risk.</w:t>
+        <w:t>This is an ecological, specialty-level analysis and cannot speak to individual career decisions. The physician census is biennial, giving 9 measured waves; we addressed the limited power directly through equivalence testing and by pooling across specialties, but residual power constraints remain and the equivalence margins are a judgement. Specialty-specific litigation counts could be recovered only from 2008; pre-2008 specialty tables were not retrievable from primary sources. Clinic counts by specialty are published only every 3 years and were used descriptively. JMSR report counts are available only from 2015 and were used in a 2016-2024 sensitivity. Litigation counts are assigned to a principal specialty and, by the Court's own note, do not measure intrinsic specialty risk.</w:t>
       </w:r>
       <w:r>
         <w:rPr>

</xml_diff>

<commit_message>
HP submission: add Nikkei Telecom media counts as sensitivity and include media coverage in model
- Add Nikkei Telecom 21 annual article counts (2004-2018) to data/
- Compute litigation-vs-media correlations and a media-adjusted annual hospital sensitivity
- Update build_reanalysis.py to generate media_correlation and media sensitivity
- Update build_hp_submission.py to cite Nikkei data, describe method, report results,
  add Supplementary Table 4, and expand limitations
- Regenerate hp_manuscript_en.docx and output/hp_submission.zip

Co-Authored-By: Tatsuki Onishi <bougtoir@gmail.com>
</commit_message>
<xml_diff>
--- a/medical_accident_its_analysis/manuscript/hp_manuscript_en.docx
+++ b/medical_accident_its_analysis/manuscript/hp_manuscript_en.docx
@@ -269,7 +269,7 @@
           <w:i w:val="0"/>
           <w:sz w:val="24"/>
         </w:rPr>
-        <w:t>. A fourth series, annual medical accident investigation reports by specialty from the Japan Medical Safety Research Organisation (JMSR, 2015-2025), was used in a sensitivity analysis.</w:t>
+        <w:t>. Two sensitivity series were also used: annual medical accident investigation reports by specialty from the Japan Medical Safety Research Organisation (JMSR, 2015-2025)</w:t>
       </w:r>
       <w:r>
         <w:rPr>
@@ -277,6 +277,22 @@
           <w:sz w:val="22"/>
         </w:rPr>
         <w:t>[11]</w:t>
+      </w:r>
+      <w:r>
+        <w:rPr>
+          <w:rFonts w:ascii="Times New Roman" w:hAnsi="Times New Roman"/>
+          <w:b w:val="0"/>
+          <w:i w:val="0"/>
+          <w:sz w:val="24"/>
+        </w:rPr>
+        <w:t xml:space="preserve"> and total national newspaper article counts from Nikkei Telecom 21 (2009–2019; keywords: 医療事故 + 医療過誤).</w:t>
+      </w:r>
+      <w:r>
+        <w:rPr>
+          <w:rFonts w:ascii="Times New Roman" w:hAnsi="Times New Roman"/>
+          <w:sz w:val="22"/>
+        </w:rPr>
+        <w:t>[12]</w:t>
       </w:r>
       <w:r>
         <w:rPr>
@@ -364,7 +380,7 @@
           <w:rFonts w:ascii="Times New Roman" w:hAnsi="Times New Roman"/>
           <w:sz w:val="22"/>
         </w:rPr>
-        <w:t>[12]</w:t>
+        <w:t>[13]</w:t>
       </w:r>
       <w:r>
         <w:rPr>
@@ -419,7 +435,7 @@
           <w:i w:val="0"/>
           <w:sz w:val="24"/>
         </w:rPr>
-        <w:t xml:space="preserve"> Sensitivity analyses repeated the models on (i) the annual hospital series, (ii) a linearly interpolated annual physician series (with degrees of freedom governed by the measured waves, not the interpolated n), (iii) raw counts instead of rates, and (iv) the annual hospital series 2016-2024 additionally controlling for the JMSR report rate (reports per 1,000 physicians). This last test evaluates whether the litigation coefficient is confounded by or collinear with broader medical accident reporting. Because the primary analyses are confirmatory and null, we did not adjust for multiplicity and interpret the single secondary association (the JOCS-CP indicator) as exploratory. Analyses used Python (statsmodels); code and data are openly available.</w:t>
+        <w:t xml:space="preserve"> Sensitivity analyses repeated the models on (i) the annual hospital series, (ii) a linearly interpolated annual physician series (with degrees of freedom governed by the measured waves, not the interpolated n), (iii) raw counts instead of rates, (iv) the annual hospital series 2016-2024 additionally controlling for the JMSR report rate (reports per 1,000 physicians), and (v) the annual hospital series 2009–2019 additionally controlling for total Nikkei Telecom article counts. Because the article-count series is a national yearly variable, it is collinear with full wave fixed effects; this sensitivity therefore uses specialty fixed effects plus a linear time trend rather than wave dummies. These last two tests evaluate whether the litigation coefficient is confounded by or collinear with broader accident reporting or media coverage. Because the primary analyses are confirmatory and null, we did not adjust for multiplicity and interpret the single secondary association (the JOCS-CP indicator) as exploratory. Analyses used Python (statsmodels); code and data are openly available.</w:t>
       </w:r>
     </w:p>
     <w:p>
@@ -2876,6 +2892,36 @@
     </w:p>
     <w:p>
       <w:pPr>
+        <w:spacing w:line="480" w:lineRule="auto" w:after="120"/>
+      </w:pPr>
+      <w:r>
+        <w:rPr>
+          <w:rFonts w:ascii="Times New Roman" w:hAnsi="Times New Roman"/>
+          <w:b w:val="0"/>
+          <w:i w:val="0"/>
+          <w:sz w:val="24"/>
+        </w:rPr>
+        <w:t>Finally, we tested national newspaper coverage from Nikkei Telecom 21 as a potential confounder.</w:t>
+      </w:r>
+      <w:r>
+        <w:rPr>
+          <w:rFonts w:ascii="Times New Roman" w:hAnsi="Times New Roman"/>
+          <w:sz w:val="22"/>
+        </w:rPr>
+        <w:t>[12]</w:t>
+      </w:r>
+      <w:r>
+        <w:rPr>
+          <w:rFonts w:ascii="Times New Roman" w:hAnsi="Times New Roman"/>
+          <w:b w:val="0"/>
+          <w:i w:val="0"/>
+          <w:sz w:val="24"/>
+        </w:rPr>
+        <w:t xml:space="preserve"> Total annual article counts (keywords: 医療事故 + 医療過誤) and total litigation counts were correlated (Pearson r=0.81), consistent with the public salience of high-litigation years; however, within the annual hospital panel the lagged litigation rate and the media-count series were only weakly correlated. A model of annual hospital growth for 2009-2019 that included both the lagged litigation rate and the lagged article count (per 1,000 articles) left the litigation coefficient essentially unchanged and the media term was not associated with hospital growth (p=0.18; Supplementary Table 4). Media coverage therefore does not account for the null litigation effect either.</w:t>
+      </w:r>
+    </w:p>
+    <w:p>
+      <w:pPr>
         <w:pStyle w:val="Heading1"/>
       </w:pPr>
       <w:r>
@@ -2946,7 +2992,7 @@
           <w:rFonts w:ascii="Times New Roman" w:hAnsi="Times New Roman"/>
           <w:sz w:val="22"/>
         </w:rPr>
-        <w:t>[13]</w:t>
+        <w:t>[14]</w:t>
       </w:r>
       <w:r>
         <w:rPr>
@@ -2962,7 +3008,7 @@
           <w:rFonts w:ascii="Times New Roman" w:hAnsi="Times New Roman"/>
           <w:sz w:val="22"/>
         </w:rPr>
-        <w:t>[14]</w:t>
+        <w:t>[15]</w:t>
       </w:r>
       <w:r>
         <w:rPr>
@@ -2978,7 +3024,7 @@
           <w:rFonts w:ascii="Times New Roman" w:hAnsi="Times New Roman"/>
           <w:sz w:val="22"/>
         </w:rPr>
-        <w:t>[15]</w:t>
+        <w:t>[16]</w:t>
       </w:r>
       <w:r>
         <w:rPr>
@@ -3008,7 +3054,7 @@
           <w:rFonts w:ascii="Times New Roman" w:hAnsi="Times New Roman"/>
           <w:sz w:val="22"/>
         </w:rPr>
-        <w:t>[16]</w:t>
+        <w:t>[17]</w:t>
       </w:r>
       <w:r>
         <w:rPr>
@@ -3024,7 +3070,7 @@
           <w:rFonts w:ascii="Times New Roman" w:hAnsi="Times New Roman"/>
           <w:sz w:val="22"/>
         </w:rPr>
-        <w:t>[17]</w:t>
+        <w:t>[18]</w:t>
       </w:r>
       <w:r>
         <w:rPr>
@@ -3054,7 +3100,7 @@
           <w:rFonts w:ascii="Times New Roman" w:hAnsi="Times New Roman"/>
           <w:sz w:val="22"/>
         </w:rPr>
-        <w:t>[18]</w:t>
+        <w:t>[19]</w:t>
       </w:r>
       <w:r>
         <w:rPr>
@@ -3084,7 +3130,7 @@
           <w:rFonts w:ascii="Times New Roman" w:hAnsi="Times New Roman"/>
           <w:sz w:val="22"/>
         </w:rPr>
-        <w:t>[19]</w:t>
+        <w:t>[20]</w:t>
       </w:r>
       <w:r>
         <w:rPr>
@@ -3100,7 +3146,7 @@
           <w:rFonts w:ascii="Times New Roman" w:hAnsi="Times New Roman"/>
           <w:sz w:val="22"/>
         </w:rPr>
-        <w:t>[20]</w:t>
+        <w:t>[21]</w:t>
       </w:r>
       <w:r>
         <w:rPr>
@@ -3130,7 +3176,7 @@
           <w:rFonts w:ascii="Times New Roman" w:hAnsi="Times New Roman"/>
           <w:sz w:val="22"/>
         </w:rPr>
-        <w:t>[21]</w:t>
+        <w:t>[22]</w:t>
       </w:r>
       <w:r>
         <w:rPr>
@@ -3146,7 +3192,7 @@
           <w:rFonts w:ascii="Times New Roman" w:hAnsi="Times New Roman"/>
           <w:sz w:val="22"/>
         </w:rPr>
-        <w:t>[22]</w:t>
+        <w:t>[23]</w:t>
       </w:r>
       <w:r>
         <w:rPr>
@@ -3190,7 +3236,7 @@
           <w:rFonts w:ascii="Times New Roman" w:hAnsi="Times New Roman"/>
           <w:sz w:val="22"/>
         </w:rPr>
-        <w:t>[23]</w:t>
+        <w:t>[24]</w:t>
       </w:r>
       <w:r>
         <w:rPr>
@@ -3206,7 +3252,7 @@
           <w:rFonts w:ascii="Times New Roman" w:hAnsi="Times New Roman"/>
           <w:sz w:val="22"/>
         </w:rPr>
-        <w:t>[24]</w:t>
+        <w:t>[25]</w:t>
       </w:r>
       <w:r>
         <w:rPr>
@@ -3236,7 +3282,7 @@
           <w:rFonts w:ascii="Times New Roman" w:hAnsi="Times New Roman"/>
           <w:sz w:val="22"/>
         </w:rPr>
-        <w:t>[25]</w:t>
+        <w:t>[26]</w:t>
       </w:r>
       <w:r>
         <w:rPr>
@@ -3271,7 +3317,7 @@
           <w:i w:val="0"/>
           <w:sz w:val="24"/>
         </w:rPr>
-        <w:t>This is an ecological, specialty-level analysis and cannot speak to individual career decisions. The physician census is biennial, giving 9 measured waves; we addressed the limited power directly through equivalence testing and by pooling across specialties, but residual power constraints remain and the equivalence margins are a judgement. Specialty-specific litigation counts could be recovered only from 2008; pre-2008 specialty tables were not retrievable from primary sources. Clinic counts by specialty are published only every 3 years and were used descriptively. JMSR report counts are available only from 2015 and were used in a 2016-2024 sensitivity. Litigation counts are assigned to a principal specialty and, by the Court's own note, do not measure intrinsic specialty risk.</w:t>
+        <w:t>This is an ecological, specialty-level analysis and cannot speak to individual career decisions. The physician census is biennial, giving 9 measured waves; we addressed the limited power directly through equivalence testing and by pooling across specialties, but residual power constraints remain and the equivalence margins are a judgement. Specialty-specific litigation counts could be recovered only from 2008; pre-2008 specialty tables were not retrievable from primary sources. Clinic counts by specialty are published only every 3 years and were used descriptively. JMSR report counts are available only from 2015 and were used in a 2016-2024 sensitivity. Media article counts are available only for 2009-2019 and are a national total, so they cannot be decomposed by specialty and are collinear with full wave fixed effects. Litigation counts are assigned to a principal specialty and, by the Court's own note, do not measure intrinsic specialty risk.</w:t>
       </w:r>
       <w:r>
         <w:rPr>
@@ -3495,7 +3541,7 @@
           <w:rFonts w:ascii="Times New Roman" w:hAnsi="Times New Roman"/>
           <w:sz w:val="20"/>
         </w:rPr>
-        <w:t>12. Angrist JD, Pischke JS. Mostly Harmless Econometrics. Princeton: Princeton University Press; 2009.</w:t>
+        <w:t>12. Nikkei Inc. Nikkei Telecom 21 (新聞・情報データベース). Tokyo: Nikkei Inc. Accessed 2024.</w:t>
       </w:r>
     </w:p>
     <w:p>
@@ -3507,7 +3553,7 @@
           <w:rFonts w:ascii="Times New Roman" w:hAnsi="Times New Roman"/>
           <w:sz w:val="20"/>
         </w:rPr>
-        <w:t>13. Matsa DA. Does malpractice liability keep the doctor away? Evidence from tort reform damage caps. J Legal Stud. 2007;36(S2):S143-S182.</w:t>
+        <w:t>13. Angrist JD, Pischke JS. Mostly Harmless Econometrics. Princeton: Princeton University Press; 2009.</w:t>
       </w:r>
     </w:p>
     <w:p>
@@ -3519,7 +3565,7 @@
           <w:rFonts w:ascii="Times New Roman" w:hAnsi="Times New Roman"/>
           <w:sz w:val="20"/>
         </w:rPr>
-        <w:t>14. Hyman DA, Silver C, Black B, Paik M. Does tort reform affect physician supply? Evidence from Texas. Int Rev Law Econ. 2015;42:203-218.</w:t>
+        <w:t>14. Matsa DA. Does malpractice liability keep the doctor away? Evidence from tort reform damage caps. J Legal Stud. 2007;36(S2):S143-S182.</w:t>
       </w:r>
     </w:p>
     <w:p>
@@ -3531,7 +3577,7 @@
           <w:rFonts w:ascii="Times New Roman" w:hAnsi="Times New Roman"/>
           <w:sz w:val="20"/>
         </w:rPr>
-        <w:t>15. Frakes MD, Frank MB, Seabury SA. The effect of malpractice law on physician supply: Evidence from negligence-standard reforms. J Health Econ. 2020;70:1-16.</w:t>
+        <w:t>15. Hyman DA, Silver C, Black B, Paik M. Does tort reform affect physician supply? Evidence from Texas. Int Rev Law Econ. 2015;42:203-218.</w:t>
       </w:r>
     </w:p>
     <w:p>
@@ -3543,7 +3589,7 @@
           <w:rFonts w:ascii="Times New Roman" w:hAnsi="Times New Roman"/>
           <w:sz w:val="20"/>
         </w:rPr>
-        <w:t>16. Kessler DP, McClellan MB. Do doctors practice defensive medicine?. Q J Econ. 1996;111(2):353-390.</w:t>
+        <w:t>16. Frakes MD, Frank MB, Seabury SA. The effect of malpractice law on physician supply: Evidence from negligence-standard reforms. J Health Econ. 2020;70:1-16.</w:t>
       </w:r>
     </w:p>
     <w:p>
@@ -3555,7 +3601,7 @@
           <w:rFonts w:ascii="Times New Roman" w:hAnsi="Times New Roman"/>
           <w:sz w:val="20"/>
         </w:rPr>
-        <w:t>17. Sloan FA, Shadle JH. Is there empirical evidence for "Defensive Medicine"? A reassessment. J Health Econ. 2008;27(2):481-491.</w:t>
+        <w:t>17. Kessler DP, McClellan MB. Do doctors practice defensive medicine?. Q J Econ. 1996;111(2):353-390.</w:t>
       </w:r>
     </w:p>
     <w:p>
@@ -3567,7 +3613,7 @@
           <w:rFonts w:ascii="Times New Roman" w:hAnsi="Times New Roman"/>
           <w:sz w:val="20"/>
         </w:rPr>
-        <w:t>18. Taniguchi K, Watari T, Nagoshi K. Characteristics and trends of medical malpractice claims in Japan between 2006 and 2021. PLoS One. 2023;18(12):e0296155.</w:t>
+        <w:t>18. Sloan FA, Shadle JH. Is there empirical evidence for "Defensive Medicine"? A reassessment. J Health Econ. 2008;27(2):481-491.</w:t>
       </w:r>
     </w:p>
     <w:p>
@@ -3579,7 +3625,7 @@
           <w:rFonts w:ascii="Times New Roman" w:hAnsi="Times New Roman"/>
           <w:sz w:val="20"/>
         </w:rPr>
-        <w:t>19. Hasegawa J, Toyokawa S, Ikenoue T, et al. Relevant obstetric factors for cerebral palsy: from the Nationwide Obstetric Compensation System in Japan. PLoS One. 2016;11(1):e0148122.</w:t>
+        <w:t>19. Taniguchi K, Watari T, Nagoshi K. Characteristics and trends of medical malpractice claims in Japan between 2006 and 2021. PLoS One. 2023;18(12):e0296155.</w:t>
       </w:r>
     </w:p>
     <w:p>
@@ -3591,7 +3637,7 @@
           <w:rFonts w:ascii="Times New Roman" w:hAnsi="Times New Roman"/>
           <w:sz w:val="20"/>
         </w:rPr>
-        <w:t>20. Morita H. Criminal prosecution and physician supply. Int Rev Law Econ. 2018;55:1-11.</w:t>
+        <w:t>20. Hasegawa J, Toyokawa S, Ikenoue T, et al. Relevant obstetric factors for cerebral palsy: from the Nationwide Obstetric Compensation System in Japan. PLoS One. 2016;11(1):e0148122.</w:t>
       </w:r>
     </w:p>
     <w:p>
@@ -3603,7 +3649,7 @@
           <w:rFonts w:ascii="Times New Roman" w:hAnsi="Times New Roman"/>
           <w:sz w:val="20"/>
         </w:rPr>
-        <w:t>21. Kamijo K, Wada Y, Ishida K, Warsof SL, Saade G, Kawakita T. Medical-legal claims in obstetrics and gynecology: Japan versus the United States. J Healthc Risk Manag. 2025;44(4):5-11.</w:t>
+        <w:t>21. Morita H. Criminal prosecution and physician supply. Int Rev Law Econ. 2018;55:1-11.</w:t>
       </w:r>
     </w:p>
     <w:p>
@@ -3615,7 +3661,7 @@
           <w:rFonts w:ascii="Times New Roman" w:hAnsi="Times New Roman"/>
           <w:sz w:val="20"/>
         </w:rPr>
-        <w:t>22. Lin PL, Huang JP, Fujii T, Cho EH, Huang MC. A survey of specialty choice among obstetrics and gynecology residents in Japan, Korea, and Taiwan. J Obstet Gynaecol Res. 2022;48(7):1968-1977.</w:t>
+        <w:t>22. Kamijo K, Wada Y, Ishida K, Warsof SL, Saade G, Kawakita T. Medical-legal claims in obstetrics and gynecology: Japan versus the United States. J Healthc Risk Manag. 2025;44(4):5-11.</w:t>
       </w:r>
     </w:p>
     <w:p>
@@ -3627,7 +3673,7 @@
           <w:rFonts w:ascii="Times New Roman" w:hAnsi="Times New Roman"/>
           <w:sz w:val="20"/>
         </w:rPr>
-        <w:t>23. Bismark M, Paterson R. No-fault compensation in New Zealand: harmonizing injury compensation, provider accountability, and patient safety. Health Aff. 2006;25(1):278-286.</w:t>
+        <w:t>23. Lin PL, Huang JP, Fujii T, Cho EH, Huang MC. A survey of specialty choice among obstetrics and gynecology residents in Japan, Korea, and Taiwan. J Obstet Gynaecol Res. 2022;48(7):1968-1977.</w:t>
       </w:r>
     </w:p>
     <w:p>
@@ -3639,7 +3685,7 @@
           <w:rFonts w:ascii="Times New Roman" w:hAnsi="Times New Roman"/>
           <w:sz w:val="20"/>
         </w:rPr>
-        <w:t>24. Mello MM, Kachalia A, Studdert DM. Administrative compensation for medical injuries: lessons from three foreign systems. New York: The Commonwealth Fund; 2011.</w:t>
+        <w:t>24. Bismark M, Paterson R. No-fault compensation in New Zealand: harmonizing injury compensation, provider accountability, and patient safety. Health Aff. 2006;25(1):278-286.</w:t>
       </w:r>
     </w:p>
     <w:p>
@@ -3651,7 +3697,19 @@
           <w:rFonts w:ascii="Times New Roman" w:hAnsi="Times New Roman"/>
           <w:sz w:val="20"/>
         </w:rPr>
-        <w:t>25. Helland E, Seabury SA. Tort reform and physician labor supply: a review of the evidence. Int Rev Law Econ. 2015;42:192-202.</w:t>
+        <w:t>25. Mello MM, Kachalia A, Studdert DM. Administrative compensation for medical injuries: lessons from three foreign systems. New York: The Commonwealth Fund; 2011.</w:t>
+      </w:r>
+    </w:p>
+    <w:p>
+      <w:pPr>
+        <w:spacing w:line="360" w:lineRule="auto"/>
+      </w:pPr>
+      <w:r>
+        <w:rPr>
+          <w:rFonts w:ascii="Times New Roman" w:hAnsi="Times New Roman"/>
+          <w:sz w:val="20"/>
+        </w:rPr>
+        <w:t>26. Helland E, Seabury SA. Tort reform and physician labor supply: a review of the evidence. Int Rev Law Econ. 2015;42:192-202.</w:t>
       </w:r>
     </w:p>
     <w:sectPr>

</xml_diff>

<commit_message>
HP submission: fix media year range off-by-one (2019->2018) and title-page supplementary table count (2->4)
Co-Authored-By: Tatsuki Onishi <bougtoir@gmail.com>
</commit_message>
<xml_diff>
--- a/medical_accident_its_analysis/manuscript/hp_manuscript_en.docx
+++ b/medical_accident_its_analysis/manuscript/hp_manuscript_en.docx
@@ -285,7 +285,7 @@
           <w:i w:val="0"/>
           <w:sz w:val="24"/>
         </w:rPr>
-        <w:t xml:space="preserve"> and total national newspaper article counts from Nikkei Telecom 21 (2009–2019; keywords: 医療事故 + 医療過誤).</w:t>
+        <w:t xml:space="preserve"> and total national newspaper article counts from Nikkei Telecom 21 (2009–2018; keywords: 医療事故 + 医療過誤).</w:t>
       </w:r>
       <w:r>
         <w:rPr>
@@ -435,7 +435,7 @@
           <w:i w:val="0"/>
           <w:sz w:val="24"/>
         </w:rPr>
-        <w:t xml:space="preserve"> Sensitivity analyses repeated the models on (i) the annual hospital series, (ii) a linearly interpolated annual physician series (with degrees of freedom governed by the measured waves, not the interpolated n), (iii) raw counts instead of rates, (iv) the annual hospital series 2016-2024 additionally controlling for the JMSR report rate (reports per 1,000 physicians), and (v) the annual hospital series 2009–2019 additionally controlling for total Nikkei Telecom article counts. Because the article-count series is a national yearly variable, it is collinear with full wave fixed effects; this sensitivity therefore uses specialty fixed effects plus a linear time trend rather than wave dummies. These last two tests evaluate whether the litigation coefficient is confounded by or collinear with broader accident reporting or media coverage. Because the primary analyses are confirmatory and null, we did not adjust for multiplicity and interpret the single secondary association (the JOCS-CP indicator) as exploratory. Analyses used Python (statsmodels); code and data are openly available.</w:t>
+        <w:t xml:space="preserve"> Sensitivity analyses repeated the models on (i) the annual hospital series, (ii) a linearly interpolated annual physician series (with degrees of freedom governed by the measured waves, not the interpolated n), (iii) raw counts instead of rates, (iv) the annual hospital series 2016-2024 additionally controlling for the JMSR report rate (reports per 1,000 physicians), and (v) the annual hospital series 2009–2018 additionally controlling for total Nikkei Telecom article counts. Because the article-count series is a national yearly variable, it is collinear with full wave fixed effects; this sensitivity therefore uses specialty fixed effects plus a linear time trend rather than wave dummies. These last two tests evaluate whether the litigation coefficient is confounded by or collinear with broader accident reporting or media coverage. Because the primary analyses are confirmatory and null, we did not adjust for multiplicity and interpret the single secondary association (the JOCS-CP indicator) as exploratory. Analyses used Python (statsmodels); code and data are openly available.</w:t>
       </w:r>
     </w:p>
     <w:p>
@@ -2917,7 +2917,7 @@
           <w:i w:val="0"/>
           <w:sz w:val="24"/>
         </w:rPr>
-        <w:t xml:space="preserve"> Total annual article counts (keywords: 医療事故 + 医療過誤) and total litigation counts were correlated (Pearson r=0.81), consistent with the public salience of high-litigation years; however, within the annual hospital panel the lagged litigation rate and the media-count series were only weakly correlated. A model of annual hospital growth for 2009-2019 that included both the lagged litigation rate and the lagged article count (per 1,000 articles) left the litigation coefficient essentially unchanged and the media term was not associated with hospital growth (p=0.18; Supplementary Table 4). Media coverage therefore does not account for the null litigation effect either.</w:t>
+        <w:t xml:space="preserve"> Total annual article counts (keywords: 医療事故 + 医療過誤) and total litigation counts were correlated (Pearson r=0.81), consistent with the public salience of high-litigation years; however, within the annual hospital panel the lagged litigation rate and the media-count series were only weakly correlated. A model of annual hospital growth for 2009-2018 that included both the lagged litigation rate and the lagged article count (per 1,000 articles) left the litigation coefficient essentially unchanged and the media term was not associated with hospital growth (p=0.18; Supplementary Table 4). Media coverage therefore does not account for the null litigation effect either.</w:t>
       </w:r>
     </w:p>
     <w:p>
@@ -3317,7 +3317,7 @@
           <w:i w:val="0"/>
           <w:sz w:val="24"/>
         </w:rPr>
-        <w:t>This is an ecological, specialty-level analysis and cannot speak to individual career decisions. The physician census is biennial, giving 9 measured waves; we addressed the limited power directly through equivalence testing and by pooling across specialties, but residual power constraints remain and the equivalence margins are a judgement. Specialty-specific litigation counts could be recovered only from 2008; pre-2008 specialty tables were not retrievable from primary sources. Clinic counts by specialty are published only every 3 years and were used descriptively. JMSR report counts are available only from 2015 and were used in a 2016-2024 sensitivity. Media article counts are available only for 2009-2019 and are a national total, so they cannot be decomposed by specialty and are collinear with full wave fixed effects. Litigation counts are assigned to a principal specialty and, by the Court's own note, do not measure intrinsic specialty risk.</w:t>
+        <w:t>This is an ecological, specialty-level analysis and cannot speak to individual career decisions. The physician census is biennial, giving 9 measured waves; we addressed the limited power directly through equivalence testing and by pooling across specialties, but residual power constraints remain and the equivalence margins are a judgement. Specialty-specific litigation counts could be recovered only from 2008; pre-2008 specialty tables were not retrievable from primary sources. Clinic counts by specialty are published only every 3 years and were used descriptively. JMSR report counts are available only from 2015 and were used in a 2016-2024 sensitivity. Media article counts are available only for 2009-2018 and are a national total, so they cannot be decomposed by specialty and are collinear with full wave fixed effects. Litigation counts are assigned to a principal specialty and, by the Court's own note, do not measure intrinsic specialty risk.</w:t>
       </w:r>
       <w:r>
         <w:rPr>

</xml_diff>